<commit_message>
Fix reported statistics, add missing reproducibility scripts, and remove self-narration
Recomputes the top-leaf CCI F statistics from raw data with a new reproducible
script, fixes stale/rounded figures in MANIFEST and table headers, and rewrites
narrative "audit/rewrite history" comments across figure and table scripts into
plain statements of the current design.
</commit_message>
<xml_diff>
--- a/analysis/results/tables/Tables.docx
+++ b/analysis/results/tables/Tables.docx
@@ -4,7 +4,7 @@
   <w:body>
     <w:p>
       <w:r>
-        <w:t>Table 1. {AUTHOR: legend missing from 09_Table_legends.md}</w:t>
+        <w:t>Table 1. Traits recorded at each leaf position, with instrument, unit and timing. The table lists ten traits. Four are the chlorophyll concentration index and the dark-adapted maximum quantum yield of photosystem II at each leaf position. Two are the within-plant ratios derived from them, and four are leaf gas-exchange variables. For each trait the table gives the abbreviation, the full name, the unit and the instrument. It also gives the sampling position, or the formula for a derived quantity, and the dates of recording. The chlorophyll concentration index is in µmol m⁻², the unit the instrument reports; rCCI and rQY are dimensionless because the units cancel in the ratio; Fv/Fm is dimensionless and bounded at 1. Gas-exchange settings were 1000 µmol m⁻² s⁻¹ photosynthetically active radiation, 30 °C leaf temperature, 60% relative humidity and 400 µmol mol⁻¹ reference CO₂. The full list of the 127 traits recorded in the experiment is in Table S3. Source: analysis/results/tables/Table1_traits.csv.</w:t>
       </w:r>
     </w:p>
     <w:tbl>
@@ -745,7 +745,7 @@
     <w:p/>
     <w:p>
       <w:r>
-        <w:t>Table 2. {AUTHOR: legend missing from 09_Table_legends.md}</w:t>
+        <w:t>Table 2. Two-way analysis of variance and variance components for rCCI_30 and QY_BL_30 at 30 days after transplanting. Plant-level data, n = 90 (15 genotypes × 2 treatments × 3 replicate plants). The table is printed in three blocks. The first gives, for each trait, the mean, standard deviation and coefficient of variation. The second gives one row per term: the degrees of freedom, mean square, F statistic and P value for genotype (df 14), nitrogen treatment (df 1) and their interaction (df 14). The residual carries 60 degrees of freedom. The third block gives the variance components σ²G, σ²T, σ²G×T and σ²e, which come from the expected mean squares of the random model by the method of moments, as set out in Methods. Their sum is σ²P, broad-sense heritability is σ²G/σ²P, and each component is also given as a percentage of σ²P. The method-of-moments estimate of σ²G for QY_BL_30 was negative and is reported as zero, with the corresponding heritability reported as zero rather than as a negative number. Truncating a component at zero and then dividing by the sum biases the remaining percentage shares upward. Because σ²T dominates the denominator, no percentage in this table tests whether genotype matters; Table S8 fits the genotype effect within each treatment, where that denominator is absent. The F statistics for the absolute readings and for rQY are those published for this experiment [29]. They are plotted in Figure 2b rather than repeated here. Source: analysis/results/tables/Table2_anova.csv, which also holds the design constants, the untruncated components and the intermediate columns that the printed table does not repeat.</w:t>
       </w:r>
     </w:p>
     <w:p>
@@ -2127,7 +2127,7 @@
     <w:p/>
     <w:p>
       <w:r>
-        <w:t>Table 3. {AUTHOR: legend missing from 09_Table_legends.md}</w:t>
+        <w:t>Table 3. Classification performance of the three candidate rules under leave-one-genotype-out cross-validation. One column per rule: rCCI_30 alone, QY_BL_30 alone, and the two together. Each of the 15 folds held out all six plants of one genotype and the discriminant was refitted on the remaining 14. The 90 pooled predictions therefore each come from a model that had never seen the genotype it scored. The rows give the number of traits, the count correct out of 90, and accuracy with its exact Clopper–Pearson 95% confidence interval. They then give sensitivity, specificity, positive and negative predictive value, and the four cells of the confusion matrix. The last rows give the number of folds in which all six held-out plants were classified correctly, with its own exact interval. Sensitivity is the proportion of low-nitrogen plants called low nitrogen. The majority-class baseline is 45 of 90. The permutation null, from 2000 shuffles of the treatment label with the whole cross-validation repeated inside each shuffle, reached the floor of that test. It is reported as P &lt; 0.0005. The three rules were scored on the same 90 plants, so their accuracies are paired. The exact McNemar comparisons between them are in Table S6, and the interval overlap between rows is not a test of a difference. Genotype is the only factor held out: environment, date, soil batch, operator, instrument and nitrogen rate are common to every fold. Source: analysis/results/tables/Table3_performance.csv.</w:t>
       </w:r>
     </w:p>
     <w:tbl>
@@ -2804,7 +2804,7 @@
     <w:p/>
     <w:p>
       <w:r>
-        <w:t>Table 4. {AUTHOR: legend missing from 09_Table_legends.md}</w:t>
+        <w:t>Table 4. The fitted linear discriminant function and its coefficients. We fitted the rule to all 90 plants at 30 days after transplanting, on rCCI_30 and QY_BL_30 in measured units. The function is D = 145.1987 − 33.7877 rCCI_30 − 160.3291 QY_BL_30. A plant is assigned to the low-nitrogen class when D &gt; 0. For each trait the table gives the raw coefficient, the coefficient standardised by the within-class standard deviation, and the 2.5th and 97.5th percentiles of 5000 bootstrap resamples of plants. Both traits are dimensionless, so the raw coefficients carry the units of D itself and are reproduced exactly as fitted, at the precision needed to reproduce the boundary. The constant has no standardised form. Neither bootstrap interval includes zero. Source: analysis/results/tables/Table4_discriminant.csv.</w:t>
       </w:r>
     </w:p>
     <w:tbl>

</xml_diff>